<commit_message>
add sleep + update report
</commit_message>
<xml_diff>
--- a/Rusanov_Aleksandr_3342_rabbit.docx
+++ b/Rusanov_Aleksandr_3342_rabbit.docx
@@ -1639,8 +1639,8 @@
         </w:rPr>
         <w:drawing>
           <wp:inline distT="0" distB="0" distL="0" distR="0" wp14:anchorId="4370E689" wp14:editId="6E192AB5">
-            <wp:extent cx="5766601" cy="2239861"/>
-            <wp:effectExtent l="0" t="0" r="0" b="0"/>
+            <wp:extent cx="5908451" cy="3741490"/>
+            <wp:effectExtent l="0" t="0" r="0" b="5080"/>
             <wp:docPr id="550047065" name="Рисунок 1"/>
             <wp:cNvGraphicFramePr>
               <a:graphicFrameLocks xmlns:a="http://schemas.openxmlformats.org/drawingml/2006/main" noChangeAspect="1"/>
@@ -1667,7 +1667,7 @@
                   <pic:spPr>
                     <a:xfrm>
                       <a:off x="0" y="0"/>
-                      <a:ext cx="5821416" cy="2261152"/>
+                      <a:ext cx="5989915" cy="3793076"/>
                     </a:xfrm>
                     <a:prstGeom prst="rect">
                       <a:avLst/>
@@ -1744,84 +1744,6 @@
     </w:p>
     <w:p>
       <w:pPr>
-        <w:jc w:val="center"/>
-        <w:rPr>
-          <w:rFonts w:ascii="Times New Roman" w:hAnsi="Times New Roman" w:cs="Times New Roman"/>
-          <w:sz w:val="28"/>
-          <w:szCs w:val="28"/>
-          <w:lang w:val="en-US"/>
-        </w:rPr>
-      </w:pPr>
-    </w:p>
-    <w:p>
-      <w:pPr>
-        <w:jc w:val="center"/>
-        <w:rPr>
-          <w:rFonts w:ascii="Times New Roman" w:hAnsi="Times New Roman" w:cs="Times New Roman"/>
-          <w:sz w:val="28"/>
-          <w:szCs w:val="28"/>
-          <w:lang w:val="en-US"/>
-        </w:rPr>
-      </w:pPr>
-    </w:p>
-    <w:p>
-      <w:pPr>
-        <w:jc w:val="center"/>
-        <w:rPr>
-          <w:rFonts w:ascii="Times New Roman" w:hAnsi="Times New Roman" w:cs="Times New Roman"/>
-          <w:sz w:val="28"/>
-          <w:szCs w:val="28"/>
-          <w:lang w:val="en-US"/>
-        </w:rPr>
-      </w:pPr>
-    </w:p>
-    <w:p>
-      <w:pPr>
-        <w:jc w:val="center"/>
-        <w:rPr>
-          <w:rFonts w:ascii="Times New Roman" w:hAnsi="Times New Roman" w:cs="Times New Roman"/>
-          <w:sz w:val="28"/>
-          <w:szCs w:val="28"/>
-          <w:lang w:val="en-US"/>
-        </w:rPr>
-      </w:pPr>
-    </w:p>
-    <w:p>
-      <w:pPr>
-        <w:jc w:val="center"/>
-        <w:rPr>
-          <w:rFonts w:ascii="Times New Roman" w:hAnsi="Times New Roman" w:cs="Times New Roman"/>
-          <w:sz w:val="28"/>
-          <w:szCs w:val="28"/>
-          <w:lang w:val="en-US"/>
-        </w:rPr>
-      </w:pPr>
-    </w:p>
-    <w:p>
-      <w:pPr>
-        <w:jc w:val="center"/>
-        <w:rPr>
-          <w:rFonts w:ascii="Times New Roman" w:hAnsi="Times New Roman" w:cs="Times New Roman"/>
-          <w:sz w:val="28"/>
-          <w:szCs w:val="28"/>
-          <w:lang w:val="en-US"/>
-        </w:rPr>
-      </w:pPr>
-    </w:p>
-    <w:p>
-      <w:pPr>
-        <w:jc w:val="center"/>
-        <w:rPr>
-          <w:rFonts w:ascii="Times New Roman" w:hAnsi="Times New Roman" w:cs="Times New Roman"/>
-          <w:sz w:val="28"/>
-          <w:szCs w:val="28"/>
-          <w:lang w:val="en-US"/>
-        </w:rPr>
-      </w:pPr>
-    </w:p>
-    <w:p>
-      <w:pPr>
-        <w:jc w:val="center"/>
         <w:rPr>
           <w:rFonts w:ascii="Times New Roman" w:hAnsi="Times New Roman" w:cs="Times New Roman"/>
           <w:sz w:val="28"/>
@@ -1920,8 +1842,8 @@
         </w:rPr>
         <w:drawing>
           <wp:inline distT="0" distB="0" distL="0" distR="0" wp14:anchorId="666AB325" wp14:editId="375C9B7F">
-            <wp:extent cx="4584319" cy="3428793"/>
-            <wp:effectExtent l="0" t="0" r="635" b="635"/>
+            <wp:extent cx="4584319" cy="3265719"/>
+            <wp:effectExtent l="0" t="0" r="635" b="0"/>
             <wp:docPr id="2067399674" name="Рисунок 1"/>
             <wp:cNvGraphicFramePr>
               <a:graphicFrameLocks xmlns:a="http://schemas.openxmlformats.org/drawingml/2006/main" noChangeAspect="1"/>
@@ -1948,7 +1870,7 @@
                   <pic:spPr>
                     <a:xfrm>
                       <a:off x="0" y="0"/>
-                      <a:ext cx="4584319" cy="3428793"/>
+                      <a:ext cx="4584319" cy="3265719"/>
                     </a:xfrm>
                     <a:prstGeom prst="rect">
                       <a:avLst/>
@@ -2072,8 +1994,8 @@
         </w:rPr>
         <w:drawing>
           <wp:inline distT="0" distB="0" distL="0" distR="0" wp14:anchorId="1918590A" wp14:editId="33297644">
-            <wp:extent cx="4693002" cy="3431098"/>
-            <wp:effectExtent l="0" t="0" r="6350" b="0"/>
+            <wp:extent cx="4716374" cy="3413341"/>
+            <wp:effectExtent l="0" t="0" r="0" b="3175"/>
             <wp:docPr id="1203819861" name="Рисунок 1"/>
             <wp:cNvGraphicFramePr>
               <a:graphicFrameLocks xmlns:a="http://schemas.openxmlformats.org/drawingml/2006/main" noChangeAspect="1"/>
@@ -2100,7 +2022,7 @@
                   <pic:spPr>
                     <a:xfrm>
                       <a:off x="0" y="0"/>
-                      <a:ext cx="4716374" cy="3448185"/>
+                      <a:ext cx="4716374" cy="3413341"/>
                     </a:xfrm>
                     <a:prstGeom prst="rect">
                       <a:avLst/>

</xml_diff>